<commit_message>
feat(dispatch): W4-D.5 DOCX template with conditional sections
Single template renders three shapes via {#hasFlatItems}/{#hasPerGradeItems}
docxtemplater conditional blocks: flat-only, per-grade-only, mixed. The
flat section uses {#flatItems} loop over { skuName, quantity }; the
per-grade section uses {#perGradeRows} (flattened from gradeAllocations)
over { skuName, grade, quantity }.

raiseDispatch.ts buildPlaceholderBag derives flatItems/perGradeRows/
hasFlatItems/hasPerGradeItems/TOTAL_QUANTITY from dispatch.lineItems.
TOTAL_KITS placeholder retired in favour of TOTAL_QUANTITY.

Tests: 5 new shape-rendering tests covering flat-only, per-grade-only,
mixed, zero-items, and the dependency-import sanity check. The fixture
in-memory .docx in raiseDispatch.test.ts now carries marker strings
inside the conditional blocks so the tests can grep them out of the
rendered zip.

Co-Authored-By: Claude Opus 4.7 (1M context) <noreply@anthropic.com>
</commit_message>
<xml_diff>
--- a/public/ops-templates/dispatch-template.docx
+++ b/public/ops-templates/dispatch-template.docx
@@ -212,6 +212,122 @@
     <w:p>
       <w:r>
         <w:t xml:space="preserve"/>
+      </w:r>
+    </w:p>
+    <w:p>
+      <w:r>
+        <w:t xml:space="preserve">{#hasFlatItems}</w:t>
+      </w:r>
+    </w:p>
+    <w:p>
+      <w:r>
+        <w:rPr>
+          <w:b/>
+          <w:bCs/>
+          <w:sz w:val="22"/>
+          <w:szCs w:val="22"/>
+        </w:rPr>
+        <w:t xml:space="preserve">Flat-quantity items</w:t>
+      </w:r>
+    </w:p>
+    <w:tbl>
+      <w:tblPr>
+        <w:tblW w:type="pct" w:w="100%"/>
+        <w:tblBorders>
+          <w:top w:val="single" w:color="475569" w:sz="6"/>
+          <w:left w:val="single" w:color="CBD5E1" w:sz="4"/>
+          <w:bottom w:val="single" w:color="475569" w:sz="6"/>
+          <w:right w:val="single" w:color="CBD5E1" w:sz="4"/>
+          <w:insideH w:val="single" w:color="CBD5E1" w:sz="4"/>
+          <w:insideV w:val="single" w:color="CBD5E1" w:sz="4"/>
+        </w:tblBorders>
+      </w:tblPr>
+      <w:tblGrid>
+        <w:gridCol w:w="100"/>
+        <w:gridCol w:w="100"/>
+      </w:tblGrid>
+      <w:tr>
+        <w:trPr>
+          <w:tblHeader/>
+        </w:trPr>
+        <w:tc>
+          <w:tcPr>
+            <w:tcW w:type="pct" w:w="75%"/>
+            <w:shd w:fill="E2E8F0"/>
+          </w:tcPr>
+          <w:p>
+            <w:r>
+              <w:rPr>
+                <w:b/>
+                <w:bCs/>
+              </w:rPr>
+              <w:t xml:space="preserve">SKU</w:t>
+            </w:r>
+          </w:p>
+        </w:tc>
+        <w:tc>
+          <w:tcPr>
+            <w:tcW w:type="pct" w:w="25%"/>
+            <w:shd w:fill="E2E8F0"/>
+          </w:tcPr>
+          <w:p>
+            <w:pPr>
+              <w:jc w:val="right"/>
+            </w:pPr>
+            <w:r>
+              <w:rPr>
+                <w:b/>
+                <w:bCs/>
+              </w:rPr>
+              <w:t xml:space="preserve">Quantity</w:t>
+            </w:r>
+          </w:p>
+        </w:tc>
+      </w:tr>
+      <w:tr>
+        <w:tc>
+          <w:p>
+            <w:r>
+              <w:t xml:space="preserve">{#flatItems}{skuName}</w:t>
+            </w:r>
+          </w:p>
+        </w:tc>
+        <w:tc>
+          <w:p>
+            <w:pPr>
+              <w:jc w:val="right"/>
+            </w:pPr>
+            <w:r>
+              <w:t xml:space="preserve">{quantity}{/flatItems}</w:t>
+            </w:r>
+          </w:p>
+        </w:tc>
+      </w:tr>
+    </w:tbl>
+    <w:p>
+      <w:r>
+        <w:t xml:space="preserve"/>
+      </w:r>
+    </w:p>
+    <w:p>
+      <w:r>
+        <w:t xml:space="preserve">{/hasFlatItems}</w:t>
+      </w:r>
+    </w:p>
+    <w:p>
+      <w:r>
+        <w:t xml:space="preserve">{#hasPerGradeItems}</w:t>
+      </w:r>
+    </w:p>
+    <w:p>
+      <w:r>
+        <w:rPr>
+          <w:b/>
+          <w:bCs/>
+          <w:sz w:val="22"/>
+          <w:szCs w:val="22"/>
+        </w:rPr>
+        <w:t xml:space="preserve">Per-grade allocations</w:t>
       </w:r>
     </w:p>
     <w:tbl>
@@ -246,13 +362,31 @@
                 <w:b/>
                 <w:bCs/>
               </w:rPr>
-              <w:t xml:space="preserve">Description</w:t>
+              <w:t xml:space="preserve">SKU</w:t>
             </w:r>
           </w:p>
         </w:tc>
         <w:tc>
           <w:tcPr>
             <w:tcW w:type="pct" w:w="15%"/>
+            <w:shd w:fill="E2E8F0"/>
+          </w:tcPr>
+          <w:p>
+            <w:pPr>
+              <w:jc w:val="center"/>
+            </w:pPr>
+            <w:r>
+              <w:rPr>
+                <w:b/>
+                <w:bCs/>
+              </w:rPr>
+              <w:t xml:space="preserve">Grade</w:t>
+            </w:r>
+          </w:p>
+        </w:tc>
+        <w:tc>
+          <w:tcPr>
+            <w:tcW w:type="pct" w:w="25%"/>
             <w:shd w:fill="E2E8F0"/>
           </w:tcPr>
           <w:p>
@@ -268,27 +402,22 @@
             </w:r>
           </w:p>
         </w:tc>
-        <w:tc>
-          <w:tcPr>
-            <w:tcW w:type="pct" w:w="25%"/>
-            <w:shd w:fill="E2E8F0"/>
-          </w:tcPr>
-          <w:p>
-            <w:r>
-              <w:rPr>
-                <w:b/>
-                <w:bCs/>
-              </w:rPr>
-              <w:t xml:space="preserve">Grade Bands</w:t>
-            </w:r>
-          </w:p>
-        </w:tc>
       </w:tr>
       <w:tr>
         <w:tc>
           <w:p>
             <w:r>
-              <w:t xml:space="preserve">{#KIT_ITEMS}{description}</w:t>
+              <w:t xml:space="preserve">{#perGradeRows}{skuName}</w:t>
+            </w:r>
+          </w:p>
+        </w:tc>
+        <w:tc>
+          <w:p>
+            <w:pPr>
+              <w:jc w:val="center"/>
+            </w:pPr>
+            <w:r>
+              <w:t xml:space="preserve">{grade}</w:t>
             </w:r>
           </w:p>
         </w:tc>
@@ -298,66 +427,38 @@
               <w:jc w:val="right"/>
             </w:pPr>
             <w:r>
-              <w:t xml:space="preserve">{quantity}{/KIT_ITEMS}</w:t>
-            </w:r>
-          </w:p>
-        </w:tc>
-        <w:tc>
-          <w:p>
-            <w:r>
-              <w:t xml:space="preserve">{grades}</w:t>
-            </w:r>
-          </w:p>
-        </w:tc>
-      </w:tr>
-      <w:tr>
-        <w:tc>
-          <w:tcPr>
-            <w:tcW w:type="pct" w:w="60%"/>
-            <w:shd w:fill="E2E8F0"/>
-          </w:tcPr>
-          <w:p>
-            <w:pPr>
-              <w:jc w:val="right"/>
-            </w:pPr>
-            <w:r>
-              <w:rPr>
-                <w:b/>
-                <w:bCs/>
-              </w:rPr>
-              <w:t xml:space="preserve">Total Kits</w:t>
-            </w:r>
-          </w:p>
-        </w:tc>
-        <w:tc>
-          <w:tcPr>
-            <w:shd w:fill="E2E8F0"/>
-          </w:tcPr>
-          <w:p>
-            <w:pPr>
-              <w:jc w:val="right"/>
-            </w:pPr>
-            <w:r>
-              <w:rPr>
-                <w:b/>
-                <w:bCs/>
-              </w:rPr>
-              <w:t xml:space="preserve">{TOTAL_KITS}</w:t>
-            </w:r>
-          </w:p>
-        </w:tc>
-        <w:tc>
-          <w:tcPr>
-            <w:shd w:fill="E2E8F0"/>
-          </w:tcPr>
-          <w:p>
-            <w:r>
-              <w:t xml:space="preserve"/>
+              <w:t xml:space="preserve">{quantity}{/perGradeRows}</w:t>
             </w:r>
           </w:p>
         </w:tc>
       </w:tr>
     </w:tbl>
+    <w:p>
+      <w:r>
+        <w:t xml:space="preserve"/>
+      </w:r>
+    </w:p>
+    <w:p>
+      <w:r>
+        <w:t xml:space="preserve">{/hasPerGradeItems}</w:t>
+      </w:r>
+    </w:p>
+    <w:p>
+      <w:r>
+        <w:rPr>
+          <w:b/>
+          <w:bCs/>
+        </w:rPr>
+        <w:t xml:space="preserve">Total kits: </w:t>
+      </w:r>
+      <w:r>
+        <w:rPr>
+          <w:b/>
+          <w:bCs/>
+        </w:rPr>
+        <w:t xml:space="preserve">{TOTAL_QUANTITY}</w:t>
+      </w:r>
+    </w:p>
     <w:p>
       <w:r>
         <w:t xml:space="preserve"/>
@@ -440,7 +541,7 @@
           <w:sz w:val="16"/>
           <w:szCs w:val="16"/>
         </w:rPr>
-        <w:t xml:space="preserve">Note (Phase 1): Intermediate states (Dispatched, In Transit) are deferred to Phase 1.1 when courier integration lands. Acknowledgement of receipt is captured via the delivery-ack flow.</w:t>
+        <w:t xml:space="preserve">Note: intermediate states (Dispatched, In Transit) are deferred to Phase 1.1 when courier integration lands. Acknowledgement of receipt is captured via the delivery-ack flow.</w:t>
       </w:r>
     </w:p>
     <w:sectPr>

</xml_diff>